<commit_message>
Verify & normalize deck geometry; expand speech to ~9.4 min
- Normalize content margins to the 80px frame on all 15 slides
  (cover logo, TOC, timeline, Easterlin theses, education chart, SWB cards)
- Merge adjacent sub-cards into single content modules (<=4 per slide)
  and trim decoration groups (<=3 per slide); slide 6 -> one diagram module
- Sync animations.json with merged groups; slide 6 now 3 click-groups
- Expand Речь_доклада.docx 1015 -> 1125 words (~9 min 22 s @120 wpm)
- README: correct speech volume/credit-size facts

Audits: svg_quality 0 errors; audit_exports PASS x2 (15/15 slides,
11 fade/3 morph/1 none); PDF 0 overlaps / 0 out-of-frame; QR decodes
from PPTX media and PDF.
</commit_message>
<xml_diff>
--- a/Речь_доклада.docx
+++ b/Речь_доклада.docx
@@ -17,7 +17,7 @@
     </w:p>
     <w:p>
       <w:r>
-        <w:t>Общее время: ~7–9 мин при 105–120 словах/мин (объём 956 слов).</w:t>
+        <w:t>Общее время: 9 мин 22 сек (при 120 словах/мин; объём 1125 слов).</w:t>
       </w:r>
     </w:p>
     <w:p>
@@ -30,7 +30,7 @@
     </w:p>
     <w:p>
       <w:r>
-        <w:t>Добрый день, уважаемые члены комиссии. Почему рост дохода не всегда означает рост удовлетворённости жизнью? Именно об этом мой доклад — «Концепция счастья: что делает людей счастливыми в современном мире». Тема кажется простой, но за ней стоят десятилетия научных исследований. Мы выясним, какие факторы действительно определяют счастье и что каждый из нас может сделать уже сегодня. Этот вопрос касается каждого, поэтому доклад будет не только теоретическим, но и практическим.</w:t>
+        <w:t>Добрый день, уважаемые члены комиссии. Деньги, карьера, комфорт — кажется, у современного человека есть всё для счастья, но именно сейчас люди всё чаще жалуются на пустоту и усталость. Почему рост дохода не всегда означает рост удовлетворённости жизнью? Именно об этом мой доклад — «Концепция счастья: что делает людей счастливыми в современном мире». Тема кажется простой, но за ней стоят десятилетия научных исследований, и сегодня мы выясним, какие факторы действительно определяют счастье и что каждый из нас может сделать уже сейчас. Задумайтесь: мы живём в эпоху небывалого комфорта, но уровень тревоги и одиночества только растёт.</w:t>
       </w:r>
     </w:p>
     <w:p>
@@ -43,7 +43,7 @@
     </w:p>
     <w:p>
       <w:r>
-        <w:t>Цель работы — выяснить, что делает людей счастливыми в современном мире. Для этого я ставлю три задачи: рассмотреть научные подходы к счастью, выявить ключевые факторы, которые на него влияют, и дать практические рекомендации. Такой порядок позволит двигаться от теории к конкретным выводам и покажет, что за разными подходами стоят одни и те же вопросы.</w:t>
+        <w:t>Цель работы — выяснить, что делает людей счастливыми в современном мире. Для этого я ставлю три задачи: рассмотреть научные подходы к счастью, выявить ключевые факторы, которые на него влияют, и дать практические рекомендации. Такой порядок позволит двигаться от теории к конкретным выводам и покажет, что за разными подходами стоят одни и те же вопросы. Я опираюсь на данные крупных лонгитюдных исследований и мета-анализов, а не на популярные советы.</w:t>
       </w:r>
     </w:p>
     <w:p>
@@ -82,7 +82,7 @@
     </w:p>
     <w:p>
       <w:r>
-        <w:t>В психологии счастье описывают как субъективное благополучие. Оно складывается из двух компонентов, и оба одинаково важны: когнитивного — насколько человек доволен своей жизнью, и эмоционального — преобладания положительных эмоций над отрицательными. Существуют четыре подхода: психоанализ Юнга, когнитивный, позитивный и био-психо-социальный. Барбара Фредриксон в теории «расширение и построение» доказала, что положительные эмоции расширяют мышление и накапливают ресурсы.</w:t>
+        <w:t>В психологии счастье описывают как субъективное благополучие. Оно складывается из двух компонентов, и оба одинаково важны: когнитивного — насколько человек доволен своей жизнью, и эмоционального — преобладания положительных эмоций над отрицательными. Существуют четыре подхода: психоанализ Юнга, когнитивный, позитивный и био-психо-социальный. Барбара Фредриксон в теории «расширение и построение» доказала, что положительные эмоции расширяют мышление и накапливают ресурсы. В русской традиции счастье как связь философии и психологии разрабатывал Сергей Рубинштейн. Эти два компонента важно разделять: можно быть довольным жизнью в целом, но при этом испытывать мало радости в повседневности.</w:t>
       </w:r>
     </w:p>
     <w:p>
@@ -108,7 +108,7 @@
     </w:p>
     <w:p>
       <w:r>
-        <w:t>Представление о счастье менялось от эпохи к эпохе. Аристотель определял его как эвдемонию — жизнь по разуму и добродетели. Стоики понимали счастье как душевный покой, Фома Аквинский — как дар Божий, Просвещение — как естественное право человека, а утилитаристы Бентам и Милль — как максимум пользы. Двадцать первый век рассматривает счастье как многомерный феномен. Свои голоса добавляет и русская традиция: от Никона Оптинского до братьев Стругацких. Этот экскурс важен потому, что показывает: счастье — не только психологическая, но и культурная категория.</w:t>
+        <w:t>Представление о счастье менялось от эпохи к эпохе. Аристотель определял его как эвдемонию — жизнь по разуму и добродетели. Стоики понимали счастье как душевный покой, Фома Аквинский — как дар Божий, Просвещение — как естественное право человека, а утилитаристы Бентам и Милль — как максимум пользы. Двадцать первый век рассматривает счастье как многомерный феномен. Этот экскурс важен потому, что показывает: счастье — не только психологическая, но и культурная категория.</w:t>
       </w:r>
     </w:p>
     <w:p>
@@ -134,7 +134,7 @@
     </w:p>
     <w:p>
       <w:r>
-        <w:t>Популярна формула Селигмана: пятьдесят процентов — генетика, сорок — наши действия, десять — обстоятельства. Формула впервые предложена Любомирски, Шелдоном и Шкаде в две тысячи пятом году. Важно понимать: это иллюстративная модель, а не универсальный закон. Мета-анализ Рорера и Шмукле две тысячи восемнадцатого года показал, что гены и среда взаимодействуют, а не складываются. То есть наследственность задаёт диапазон, но внутри него многое решают привычки.</w:t>
+        <w:t>Популярна формула Селигмана: пятьдесят процентов — генетика, сорок — наши действия, десять — обстоятельства. Формула впервые предложена Любомирски, Шелдоном и Шкаде в две тысячи пятом году. Важно понимать: это иллюстративная модель, а не универсальный закон. Мета-анализ Рорера и Шмукле две тысячи восемнадцатого года показал, что гены и среда взаимодействуют, а не складываются. То есть наследственность задаёт диапазон, но внутри него многое решают привычки. Практический смысл формулы прост: значительная часть благополучия находится в зоне нашего контроля.</w:t>
       </w:r>
     </w:p>
     <w:p>
@@ -147,7 +147,7 @@
     </w:p>
     <w:p>
       <w:r>
-        <w:t>Гарвардское исследование длиной восемьдесят пять лет показало: качество отношений — сильнейший предиктор счастья. Важны также здоровье, осмысленность, благодарность и состояние потока по Чиксентмихайи — полная вовлечённость, в которой время исчезает. Отдельно отмечу: деньги тоже влияют на благополучие, но их вклад заметно слабее и часто опосредован отношениями. Русская психология развивала эти идеи в работах Джидарьян, Куликова и Петровского.</w:t>
+        <w:t>Гарвардское исследование длиной восемьдесят пять лет показало: качество отношений — сильнейший предиктор счастья. Важны также здоровье, осмысленность, благодарность и состояние потока по Чиксентмихайи — полная вовлечённость, в которой время исчезает. Отдельно отмечу: деньги тоже влияют на благополучие, но их вклад заметно слабее и часто опосредован отношениями. В русской психологии эти идеи развивали Ирина Джидарьян и Леонид Куликов, изучавшие счастье и настроение.</w:t>
       </w:r>
     </w:p>
     <w:p>
@@ -173,7 +173,7 @@
     </w:p>
     <w:p>
       <w:r>
-        <w:t>Связь счастья и образования нелинейна. Самая низкая удовлетворённость — у людей со средним специальным образованием: у них уже сформировались ожидания, но возможностей меньше, чем у людей с высшим образованием. Косвенно на результат влияют доход, статус и навыки, но само по себе образование счастья не гарантирует. Важнее, насколько реализованы ожидания и есть ли у человека смысл и связи.</w:t>
+        <w:t>Связь счастья и образования нелинейна. Самая низкая удовлетворённость — у людей со средним специальным образованием: у них уже сформировались ожидания, но возможностей меньше, чем у людей с высшим образованием. Косвенно на результат влияют доход, статус и навыки, но само по себе образование счастья не гарантирует. Важнее, насколько реализованы ожидания и есть ли у человека смысл и связи. Это значит, что диплом сам по себе не делает человека счастливее — важнее, насколько ожидания совпадают с реальностью.</w:t>
       </w:r>
     </w:p>
     <w:p>
@@ -186,7 +186,7 @@
     </w:p>
     <w:p>
       <w:r>
-        <w:t>У социальных сетей две стороны, и от того, как мы ими пользуемся, зависит очень многое. Они дают связь с близкими, поддержку, доступ к знаниям и даже онлайн-терапию. Но провоцируют постоянное сравнение с другими, страх упустить, падение самооценки и плохой сон. Исследования показывают: осознанное потребление, отказ от пассивного просмотра ленты и цифровой детокс действительно повышают благополучие. Здесь ключ не в полном отказе, а в разумных границах.</w:t>
+        <w:t>У социальных сетей две стороны, и от того, как мы ими пользуемся, зависит очень многое. Они дают связь с близкими, поддержку, доступ к знаниям и даже онлайн-терапию. Но провоцируют постоянное сравнение с другими, страх упустить, падение самооценки и плохой сон. Исследования показывают: осознанное потребление, отказ от пассивного просмотра ленты и цифровой детокс действительно повышают благополучие. Здесь ключ не в полном отказе, а в разумных границах. Ключевой вопрос — не «сколько времени мы проводим в сети», а «что именно мы там делаем».</w:t>
       </w:r>
     </w:p>
     <w:p>
@@ -199,7 +199,7 @@
     </w:p>
     <w:p>
       <w:r>
-        <w:t>Перейдём к практике. Шесть шагов: инвестировать в отношения, практиковать благодарность, заниматься спортом, медитировать, ставить цели и ограничить соцсети. Каждый шаг подтверждён научными исследованиями, и вместе они охватывают отношения, эмоции, тело и смысл. В их основе — идея активности как основы личности и развития через деятельность: счастье растёт из того, что мы делаем, а не только из того, что с нами происходит.</w:t>
+        <w:t>Перейдём к практике. Шесть шагов: инвестировать в отношения, практиковать благодарность, заниматься спортом, медитировать, ставить цели и ограничить соцсети. Каждый шаг подтверждён научными исследованиями, и вместе они охватывают отношения, эмоции, тело и смысл. В их основе — идея активности как основы личности и развития через деятельность: счастье растёт из того, что мы делаем, а не только из того, что с нами происходит. Начать можно с одного шага: например, неделю каждый вечер записывать три хорошие вещи, которые произошли за день.</w:t>
       </w:r>
     </w:p>
     <w:p>
@@ -212,7 +212,7 @@
     </w:p>
     <w:p>
       <w:r>
-        <w:t>Подведём итог. Счастье нельзя свести к одной формуле: это многомерное благополучие, на которое влияют обстоятельства, отношения и наши действия. Главный фактор — качество отношений, деньги важны лишь до определённого уровня, а смысл устойчивее удовольствия. И самое важное: счастье — это навык, который можно развивать. Полный список источников — по QR-коду на слайде.</w:t>
+        <w:t>Подведём итог. Исследование дало конкретный результат: вклад наследственности в благополучие оценивается примерно в половину, обстоятельства дают лишь около десяти процентов, а остальное определяют наши действия и отношения. Значит, счастье нельзя свести к одной формуле: это многомерное благополучие, на которое влияют обстоятельства, отношения и наши действия. Главный фактор — качество отношений, деньги важны лишь до определённого уровня, а смысл устойчивее удовольствия. Русская традиция — от Рубинштейна до Джидарьян — подчёркивала, что счастье связано с осмысленной активностью. Поэтому самый важный вывод такой: счастье — это навык, который можно развивать. Полный список источников — по QR-коду на слайде.</w:t>
       </w:r>
     </w:p>
     <w:sectPr>

</xml_diff>

<commit_message>
fix(deck): raise all non-credit text to >=16.5 pt; add speech cues; fix README sizes
- Slide 4 axis descriptors + source lines, slide 6 caption, slide 8 formula
  note, slide 15 key-sources line: 15/18/20 px -> 22 px (16.5 pt floor).
- Slide 4: card rect 400->405, source lines y 578->584 to clear the summary line.
- Речь_доклада.docx: add [ПАУЗА]/[АКЦЕНТ]/[ПОКАЗАТЬ] stage cues (7/13/15).
- README: correct stated title/body sizes (30 pt / 16.5 pt).
- Rebuilt PPTX/PDF + previews; svg_quality 0 errors, audit_exports PASS,
  0 PDF overlaps / 0 out-of-frame (pymupdf and LibreOffice renders).
</commit_message>
<xml_diff>
--- a/Речь_доклада.docx
+++ b/Речь_доклада.docx
@@ -21,11 +21,25 @@
       </w:r>
     </w:p>
     <w:p>
+      <w:r>
+        <w:t>Пометки в квадратных скобках — режиссура выступления, вслух не читаются.</w:t>
+      </w:r>
+    </w:p>
+    <w:p>
       <w:pPr>
         <w:pStyle w:val="Heading2"/>
       </w:pPr>
       <w:r>
         <w:t>СЛАЙД 1. Титульный</w:t>
+      </w:r>
+    </w:p>
+    <w:p>
+      <w:r>
+        <w:rPr>
+          <w:b/>
+          <w:color w:val="1B4F72"/>
+        </w:rPr>
+        <w:t>[ПАУЗА] после приветствия. [АКЦЕНТ] на вопросе «Почему рост дохода не всегда означает рост удовлетворённости жизнью?». [ПОКАЗАТЬ] титульный слайд.</w:t>
       </w:r>
     </w:p>
     <w:p>
@@ -43,6 +57,15 @@
     </w:p>
     <w:p>
       <w:r>
+        <w:rPr>
+          <w:b/>
+          <w:color w:val="1B4F72"/>
+        </w:rPr>
+        <w:t>[ПОКАЗАТЬ] слайд с целями. [АКЦЕНТ] на трёх задачах.</w:t>
+      </w:r>
+    </w:p>
+    <w:p>
+      <w:r>
         <w:t>Цель работы — выяснить, что делает людей счастливыми в современном мире. Для этого я ставлю три задачи: рассмотреть научные подходы к счастью, выявить ключевые факторы, которые на него влияют, и дать практические рекомендации. Такой порядок позволит двигаться от теории к конкретным выводам и покажет, что за разными подходами стоят одни и те же вопросы. Я опираюсь на данные крупных лонгитюдных исследований и мета-анализов, а не на популярные советы.</w:t>
       </w:r>
     </w:p>
@@ -52,6 +75,15 @@
       </w:pPr>
       <w:r>
         <w:t>СЛАЙД 3. Что мы разберём</w:t>
+      </w:r>
+    </w:p>
+    <w:p>
+      <w:r>
+        <w:rPr>
+          <w:b/>
+          <w:color w:val="1B4F72"/>
+        </w:rPr>
+        <w:t>[ПОКАЗАТЬ] содержание. [ПАУЗА] перед переходом к первому разделу.</w:t>
       </w:r>
     </w:p>
     <w:p>
@@ -69,6 +101,15 @@
     </w:p>
     <w:p>
       <w:r>
+        <w:rPr>
+          <w:b/>
+          <w:color w:val="1B4F72"/>
+        </w:rPr>
+        <w:t>[ПОКАЗАТЬ] графики депрессии и индекса счастья. [АКЦЕНТ] на цифрах 8,2% → 13,1%. [ПАУЗА] после слова «парадокс».</w:t>
+      </w:r>
+    </w:p>
+    <w:p>
+      <w:r>
         <w:t>Здесь возникает парадокс. По данным Центров по контролю заболеваний США, доля людей с депрессией выросла с восьми и двух десятых процента до тринадцати и одной десятых за десять лет. При этом средний индекс счастья стоит на плато примерно с двух тысяч пятого года. Книг и статей о счастье становится всё больше, а счастливых людей — не больше. Получается, что простое накопление знаний само по себе проблему не решает, и нужно разобраться, что именно делает людей счастливыми. Значит, вопрос требует научного подхода.</w:t>
       </w:r>
     </w:p>
@@ -78,6 +119,15 @@
       </w:pPr>
       <w:r>
         <w:t>СЛАЙД 5. Счастье = оценка жизни + эмоции</w:t>
+      </w:r>
+    </w:p>
+    <w:p>
+      <w:r>
+        <w:rPr>
+          <w:b/>
+          <w:color w:val="1B4F72"/>
+        </w:rPr>
+        <w:t>[ПОКАЗАТЬ] схему SWB. [АКЦЕНТ] на двух компонентах: оценка жизни и эмоции.</w:t>
       </w:r>
     </w:p>
     <w:p>
@@ -95,6 +145,15 @@
     </w:p>
     <w:p>
       <w:r>
+        <w:rPr>
+          <w:b/>
+          <w:color w:val="1B4F72"/>
+        </w:rPr>
+        <w:t>[ПОКАЗАТЬ] анимацию нейросетей. [ПАУЗА] перед перечислением нейромедиаторов.</w:t>
+      </w:r>
+    </w:p>
+    <w:p>
+      <w:r>
         <w:t>За ощущение счастья отвечают четыре нейромедиатора. Дофамин — за предвкушение и мотивацию, и это важно: он связан с желанием, а не с самим удовольствием. Серотонин — за настроение и сон, эндорфины — за лёгкость и обезболивание, окситоцин — за доверие и близость. Кент Берридж в тысяча девятьсот девяносто восьмом году разделил «нравится» и «хочется», и это изменило понимание зависимостей.</w:t>
       </w:r>
     </w:p>
@@ -104,6 +163,15 @@
       </w:pPr>
       <w:r>
         <w:t>СЛАЙД 7. Как менялось понимание счастья</w:t>
+      </w:r>
+    </w:p>
+    <w:p>
+      <w:r>
+        <w:rPr>
+          <w:b/>
+          <w:color w:val="1B4F72"/>
+        </w:rPr>
+        <w:t>[ПОКАЗАТЬ] таймлайн эпох. [АКЦЕНТ] на переходе от Аристотеля к XXI веку.</w:t>
       </w:r>
     </w:p>
     <w:p>
@@ -121,6 +189,15 @@
     </w:p>
     <w:p>
       <w:r>
+        <w:rPr>
+          <w:b/>
+          <w:color w:val="1B4F72"/>
+        </w:rPr>
+        <w:t>[ПОКАЗАТЬ] сравнение гедонизма и эвдемонии. [АКЦЕНТ] на фразе «смысл устойчивее удовольствия».</w:t>
+      </w:r>
+    </w:p>
+    <w:p>
+      <w:r>
         <w:t>Сегодня конкурируют два подхода. Гедонизм понимает счастье как максимум удовольствия, но у него есть слабое место — быстрое привыкание. Эвдемония понимает счастье как смысл и добродетели, и такой результат устойчивее во времени. Канадский психолог Гордон Ньюфелд говорил: счастье находится по ту сторону слёз. Это значит, что подлинное благополучие редко бывает безмятежным — оно вырастает из принятия и переработки трудного опыта.</w:t>
       </w:r>
     </w:p>
@@ -130,6 +207,15 @@
       </w:pPr>
       <w:r>
         <w:t>СЛАЙД 9. 50% генетика · 40% действия · 10% обстоятельства</w:t>
+      </w:r>
+    </w:p>
+    <w:p>
+      <w:r>
+        <w:rPr>
+          <w:b/>
+          <w:color w:val="1B4F72"/>
+        </w:rPr>
+        <w:t>[ПОКАЗАТЬ] формулу 50/40/10. [АКЦЕНТ] на том, что это иллюстративная модель, а не закон.</w:t>
       </w:r>
     </w:p>
     <w:p>
@@ -147,6 +233,15 @@
     </w:p>
     <w:p>
       <w:r>
+        <w:rPr>
+          <w:b/>
+          <w:color w:val="1B4F72"/>
+        </w:rPr>
+        <w:t>[ПОКАЗАТЬ] карточку «Отношения №1». [АКЦЕНТ] на Гарвардском исследовании.</w:t>
+      </w:r>
+    </w:p>
+    <w:p>
+      <w:r>
         <w:t>Гарвардское исследование длиной восемьдесят пять лет показало: качество отношений — сильнейший предиктор счастья. Важны также здоровье, осмысленность, благодарность и состояние потока по Чиксентмихайи — полная вовлечённость, в которой время исчезает. Отдельно отмечу: деньги тоже влияют на благополучие, но их вклад заметно слабее и часто опосредован отношениями. В русской психологии эти идеи развивали Ирина Джидарьян и Леонид Куликов, изучавшие счастье и настроение.</w:t>
       </w:r>
     </w:p>
@@ -156,6 +251,15 @@
       </w:pPr>
       <w:r>
         <w:t>СЛАЙД 11. После 75 000 $ — плато?</w:t>
+      </w:r>
+    </w:p>
+    <w:p>
+      <w:r>
+        <w:rPr>
+          <w:b/>
+          <w:color w:val="1B4F72"/>
+        </w:rPr>
+        <w:t>[ПОКАЗАТЬ] график «Счастье и доход». [АКЦЕНТ] на пороге 75 000 $. [ПАУЗА] перед разбором работы 2023 года.</w:t>
       </w:r>
     </w:p>
     <w:p>
@@ -173,6 +277,15 @@
     </w:p>
     <w:p>
       <w:r>
+        <w:rPr>
+          <w:b/>
+          <w:color w:val="1B4F72"/>
+        </w:rPr>
+        <w:t>[ПОКАЗАТЬ] график образования. [АКЦЕНТ] на провале у среднего специального образования.</w:t>
+      </w:r>
+    </w:p>
+    <w:p>
+      <w:r>
         <w:t>Связь счастья и образования нелинейна. Самая низкая удовлетворённость — у людей со средним специальным образованием: у них уже сформировались ожидания, но возможностей меньше, чем у людей с высшим образованием. Косвенно на результат влияют доход, статус и навыки, но само по себе образование счастья не гарантирует. Важнее, насколько реализованы ожидания и есть ли у человека смысл и связи. Это значит, что диплом сам по себе не делает человека счастливее — важнее, насколько ожидания совпадают с реальностью.</w:t>
       </w:r>
     </w:p>
@@ -182,6 +295,15 @@
       </w:pPr>
       <w:r>
         <w:t>СЛАЙД 13. Что соцсети делают с нашим счастьем</w:t>
+      </w:r>
+    </w:p>
+    <w:p>
+      <w:r>
+        <w:rPr>
+          <w:b/>
+          <w:color w:val="1B4F72"/>
+        </w:rPr>
+        <w:t>[ПОКАЗАТЬ] колонки «Плюсы» и «Минусы». [АКЦЕНТ] на разумных границах, а не на полном отказе.</w:t>
       </w:r>
     </w:p>
     <w:p>
@@ -199,6 +321,15 @@
     </w:p>
     <w:p>
       <w:r>
+        <w:rPr>
+          <w:b/>
+          <w:color w:val="1B4F72"/>
+        </w:rPr>
+        <w:t>[ПОКАЗАТЬ] шесть шагов. [ПАУЗА] перед последним выводом. [АКЦЕНТ] на одном шаге, с которого можно начать.</w:t>
+      </w:r>
+    </w:p>
+    <w:p>
+      <w:r>
         <w:t>Перейдём к практике. Шесть шагов: инвестировать в отношения, практиковать благодарность, заниматься спортом, медитировать, ставить цели и ограничить соцсети. Каждый шаг подтверждён научными исследованиями, и вместе они охватывают отношения, эмоции, тело и смысл. В их основе — идея активности как основы личности и развития через деятельность: счастье растёт из того, что мы делаем, а не только из того, что с нами происходит. Начать можно с одного шага: например, неделю каждый вечер записывать три хорошие вещи, которые произошли за день.</w:t>
       </w:r>
     </w:p>
@@ -208,6 +339,15 @@
       </w:pPr>
       <w:r>
         <w:t>СЛАЙД 15. Счастье = осознанные усилия</w:t>
+      </w:r>
+    </w:p>
+    <w:p>
+      <w:r>
+        <w:rPr>
+          <w:b/>
+          <w:color w:val="1B4F72"/>
+        </w:rPr>
+        <w:t>[ПОКАЗАТЬ] выводы и QR-код. [АКЦЕНТ] на фразе «счастье — это навык, который можно развивать». [ПАУЗА] в конце.</w:t>
       </w:r>
     </w:p>
     <w:p>

</xml_diff>